<commit_message>
added published report screenshot
</commit_message>
<xml_diff>
--- a/PowerBI Final Project/PowerBI_Final_Project_Tutisani.docx
+++ b/PowerBI Final Project/PowerBI_Final_Project_Tutisani.docx
@@ -271,10 +271,10 @@
         <w:pStyle w:val="BodyText"/>
       </w:pPr>
     </w:p>
-    <w:bookmarkStart w:id="1" w:name="_Toc456598587" w:displacedByCustomXml="next"/>
-    <w:bookmarkStart w:id="2" w:name="_Toc456600918" w:displacedByCustomXml="next"/>
-    <w:bookmarkStart w:id="3" w:name="_Toc2484421" w:displacedByCustomXml="next"/>
-    <w:bookmarkStart w:id="4" w:name="_Toc4475558" w:displacedByCustomXml="next"/>
+    <w:bookmarkStart w:id="1" w:name="_Toc4475558" w:displacedByCustomXml="next"/>
+    <w:bookmarkStart w:id="2" w:name="_Toc2484421" w:displacedByCustomXml="next"/>
+    <w:bookmarkStart w:id="3" w:name="_Toc456600918" w:displacedByCustomXml="next"/>
+    <w:bookmarkStart w:id="4" w:name="_Toc456598587" w:displacedByCustomXml="next"/>
     <w:sdt>
       <w:sdtPr>
         <w:rPr>
@@ -1798,13 +1798,7 @@
         <w:pStyle w:val="BodyText"/>
       </w:pPr>
       <w:r>
-        <w:t>End user: Sales Operations Manager and regional Category Managers</w:t>
-      </w:r>
-      <w:r>
-        <w:t>,</w:t>
-      </w:r>
-      <w:r>
-        <w:t xml:space="preserve"> non-technical business users who need answers in seconds, not a data model to query.</w:t>
+        <w:t>End user: Sales Operations Manager and regional Category Managers, non-technical business users who need answers in seconds, not a data model to query.</w:t>
       </w:r>
     </w:p>
     <w:p>
@@ -1812,13 +1806,7 @@
         <w:pStyle w:val="BodyText"/>
       </w:pPr>
       <w:r>
-        <w:t>Logo: The Meridian Supply Co. logo uses an upward staircase of four horizontal bars in increasing height, positioned left-to-right in amber (#ED7D31), symbolizing growth, progress, and expanding inventory. Below the icon sits "MERIDIAN SUPPLY CO." in bold Segoe UI, navy (#1F3864). The staircase reads as both upward momentum and a stylized stack of supply boxes</w:t>
-      </w:r>
-      <w:r>
-        <w:t>,</w:t>
-      </w:r>
-      <w:r>
-        <w:t xml:space="preserve"> fitting for a company helping customers climb toward their goals.</w:t>
+        <w:t>Logo: The Meridian Supply Co. logo uses an upward staircase of four horizontal bars in increasing height, positioned left-to-right in amber (#ED7D31), symbolizing growth, progress, and expanding inventory. Below the icon sits "MERIDIAN SUPPLY CO." in bold Segoe UI, navy (#1F3864). The staircase reads as both upward momentum and a stylized stack of supply boxes, fitting for a company helping customers climb toward their goals.</w:t>
       </w:r>
     </w:p>
     <w:p>
@@ -1936,13 +1924,7 @@
         <w:pStyle w:val="BodyText"/>
       </w:pPr>
       <w:r>
-        <w:t>Brand palette: Navy #1F3864 (primary), Gray #595959 (secondary/text), Amber #ED7D31</w:t>
-      </w:r>
-      <w:r>
-        <w:t xml:space="preserve"> (</w:t>
-      </w:r>
-      <w:r>
-        <w:t>accent/highlight). Segoe UI is used throughout for typography.</w:t>
+        <w:t>Brand palette: Navy #1F3864 (primary), Gray #595959 (secondary/text), Amber #ED7D31 (accent/highlight). Segoe UI is used throughout for typography.</w:t>
       </w:r>
     </w:p>
     <w:p>
@@ -2031,29 +2013,13 @@
         <w:pStyle w:val="BodyText"/>
       </w:pPr>
       <w:r>
-        <w:t xml:space="preserve">The report connects to a PostgreSQL data warehouse built specifically for this project, accessing the </w:t>
-      </w:r>
-      <w:proofErr w:type="spellStart"/>
-      <w:r>
-        <w:t>bl_dm</w:t>
-      </w:r>
-      <w:proofErr w:type="spellEnd"/>
-      <w:r>
-        <w:t xml:space="preserve"> schema</w:t>
+        <w:t>The report connects to a PostgreSQL data warehouse built specifically for this project, accessing the bl_dm schema</w:t>
       </w:r>
       <w:r>
         <w:t>,</w:t>
       </w:r>
       <w:r>
-        <w:t xml:space="preserve"> the dimensional layer sitting on top of a 3NF business layer and a staging layer, populated from domestic and international sales source files (CSV format). Data was loaded using Import mode rather than </w:t>
-      </w:r>
-      <w:proofErr w:type="spellStart"/>
-      <w:r>
-        <w:t>DirectQuery</w:t>
-      </w:r>
-      <w:proofErr w:type="spellEnd"/>
-      <w:r>
-        <w:t>.</w:t>
+        <w:t xml:space="preserve"> the dimensional layer sitting on top of a 3NF business layer and a staging layer, populated from domestic and international sales source files (CSV format). Data was loaded using Import mode rather than DirectQuery.</w:t>
       </w:r>
     </w:p>
     <w:p>
@@ -2080,23 +2046,7 @@
         <w:spacing w:after="120"/>
       </w:pPr>
       <w:r>
-        <w:t xml:space="preserve">In Power Query, all tables and columns were renamed from their database-style names (e.g., </w:t>
-      </w:r>
-      <w:proofErr w:type="spellStart"/>
-      <w:r>
-        <w:t>sales_amt</w:t>
-      </w:r>
-      <w:proofErr w:type="spellEnd"/>
-      <w:r>
-        <w:t xml:space="preserve">, </w:t>
-      </w:r>
-      <w:proofErr w:type="spellStart"/>
-      <w:r>
-        <w:t>dim_geography</w:t>
-      </w:r>
-      <w:proofErr w:type="spellEnd"/>
-      <w:r>
-        <w:t>) to business-friendly names (e.g., "Sales Amount", "Geography"), so that every visual, tooltip, and field list inherits a clean label automatically rather than needing to be retitled one visual at a time.</w:t>
+        <w:t>In Power Query, all tables and columns were renamed from their database-style names (e.g., sales_amt, dim_geography) to business-friendly names (e.g., "Sales Amount", "Geography"), so that every visual, tooltip, and field list inherits a clean label automatically rather than needing to be retitled one visual at a time.</w:t>
       </w:r>
       <w:r>
         <w:t xml:space="preserve"> Tables below show what got renamed.</w:t>
@@ -2217,14 +2167,12 @@
                 <w:rFonts w:ascii="Trebuchet MS" w:hAnsi="Trebuchet MS"/>
               </w:rPr>
             </w:pPr>
-            <w:proofErr w:type="spellStart"/>
             <w:r>
               <w:rPr>
                 <w:rFonts w:ascii="Trebuchet MS" w:hAnsi="Trebuchet MS"/>
               </w:rPr>
               <w:t>fct_sales_dd</w:t>
             </w:r>
-            <w:proofErr w:type="spellEnd"/>
           </w:p>
         </w:tc>
         <w:tc>
@@ -2283,14 +2231,12 @@
                 <w:rFonts w:ascii="Trebuchet MS" w:hAnsi="Trebuchet MS"/>
               </w:rPr>
             </w:pPr>
-            <w:proofErr w:type="spellStart"/>
             <w:r>
               <w:rPr>
                 <w:rFonts w:ascii="Trebuchet MS" w:hAnsi="Trebuchet MS"/>
               </w:rPr>
               <w:t>dim_time_day</w:t>
             </w:r>
-            <w:proofErr w:type="spellEnd"/>
           </w:p>
         </w:tc>
         <w:tc>
@@ -2349,14 +2295,12 @@
                 <w:rFonts w:ascii="Trebuchet MS" w:hAnsi="Trebuchet MS"/>
               </w:rPr>
             </w:pPr>
-            <w:proofErr w:type="spellStart"/>
             <w:r>
               <w:rPr>
                 <w:rFonts w:ascii="Trebuchet MS" w:hAnsi="Trebuchet MS"/>
               </w:rPr>
               <w:t>dim_products</w:t>
             </w:r>
-            <w:proofErr w:type="spellEnd"/>
           </w:p>
         </w:tc>
         <w:tc>
@@ -2415,14 +2359,12 @@
                 <w:rFonts w:ascii="Trebuchet MS" w:hAnsi="Trebuchet MS"/>
               </w:rPr>
             </w:pPr>
-            <w:proofErr w:type="spellStart"/>
             <w:r>
               <w:rPr>
                 <w:rFonts w:ascii="Trebuchet MS" w:hAnsi="Trebuchet MS"/>
               </w:rPr>
               <w:t>dim_customers_scd</w:t>
             </w:r>
-            <w:proofErr w:type="spellEnd"/>
           </w:p>
         </w:tc>
         <w:tc>
@@ -2481,14 +2423,12 @@
                 <w:rFonts w:ascii="Trebuchet MS" w:hAnsi="Trebuchet MS"/>
               </w:rPr>
             </w:pPr>
-            <w:proofErr w:type="spellStart"/>
             <w:r>
               <w:rPr>
                 <w:rFonts w:ascii="Trebuchet MS" w:hAnsi="Trebuchet MS"/>
               </w:rPr>
               <w:t>dim_geography</w:t>
             </w:r>
-            <w:proofErr w:type="spellEnd"/>
           </w:p>
         </w:tc>
         <w:tc>
@@ -2547,14 +2487,12 @@
                 <w:rFonts w:ascii="Trebuchet MS" w:hAnsi="Trebuchet MS"/>
               </w:rPr>
             </w:pPr>
-            <w:proofErr w:type="spellStart"/>
             <w:r>
               <w:rPr>
                 <w:rFonts w:ascii="Trebuchet MS" w:hAnsi="Trebuchet MS"/>
               </w:rPr>
               <w:t>dim_employees</w:t>
             </w:r>
-            <w:proofErr w:type="spellEnd"/>
           </w:p>
         </w:tc>
         <w:tc>
@@ -2613,14 +2551,12 @@
                 <w:rFonts w:ascii="Trebuchet MS" w:hAnsi="Trebuchet MS"/>
               </w:rPr>
             </w:pPr>
-            <w:proofErr w:type="spellStart"/>
             <w:r>
               <w:rPr>
                 <w:rFonts w:ascii="Trebuchet MS" w:hAnsi="Trebuchet MS"/>
               </w:rPr>
               <w:t>dim_order_attributes</w:t>
             </w:r>
-            <w:proofErr w:type="spellEnd"/>
           </w:p>
         </w:tc>
         <w:tc>
@@ -2713,39 +2649,7 @@
         <w:pStyle w:val="BodyText"/>
       </w:pPr>
       <w:r>
-        <w:t>Audit columns (</w:t>
-      </w:r>
-      <w:proofErr w:type="spellStart"/>
-      <w:r>
-        <w:t>insert_dt</w:t>
-      </w:r>
-      <w:proofErr w:type="spellEnd"/>
-      <w:r>
-        <w:t xml:space="preserve">, </w:t>
-      </w:r>
-      <w:proofErr w:type="spellStart"/>
-      <w:r>
-        <w:t>update_dt</w:t>
-      </w:r>
-      <w:proofErr w:type="spellEnd"/>
-      <w:r>
-        <w:t xml:space="preserve">, </w:t>
-      </w:r>
-      <w:proofErr w:type="spellStart"/>
-      <w:r>
-        <w:t>source_system</w:t>
-      </w:r>
-      <w:proofErr w:type="spellEnd"/>
-      <w:r>
-        <w:t xml:space="preserve">, </w:t>
-      </w:r>
-      <w:proofErr w:type="spellStart"/>
-      <w:r>
-        <w:t>source_entity</w:t>
-      </w:r>
-      <w:proofErr w:type="spellEnd"/>
-      <w:r>
-        <w:t>) were removed from all tables, as they carry no reporting value and only clutter the field list.</w:t>
+        <w:t>Audit columns (insert_dt, update_dt, source_system, source_entity) were removed from all tables, as they carry no reporting value and only clutter the field list.</w:t>
       </w:r>
     </w:p>
     <w:p>
@@ -2759,47 +2663,7 @@
         <w:t>,</w:t>
       </w:r>
       <w:r>
-        <w:t xml:space="preserve"> one row for each version of their record as attributes changed over time. To allow a clean one-to-many relationship into the fact table, the table was filtered to active records only (</w:t>
-      </w:r>
-      <w:proofErr w:type="spellStart"/>
-      <w:r>
-        <w:t>is_active</w:t>
-      </w:r>
-      <w:proofErr w:type="spellEnd"/>
-      <w:r>
-        <w:t xml:space="preserve"> = 'Y') and the now-redundant versioning columns (</w:t>
-      </w:r>
-      <w:proofErr w:type="spellStart"/>
-      <w:r>
-        <w:t>start_dt</w:t>
-      </w:r>
-      <w:proofErr w:type="spellEnd"/>
-      <w:r>
-        <w:t xml:space="preserve">, </w:t>
-      </w:r>
-      <w:proofErr w:type="spellStart"/>
-      <w:r>
-        <w:t>end_dt</w:t>
-      </w:r>
-      <w:proofErr w:type="spellEnd"/>
-      <w:r>
-        <w:t xml:space="preserve">, </w:t>
-      </w:r>
-      <w:proofErr w:type="spellStart"/>
-      <w:r>
-        <w:t>is_active</w:t>
-      </w:r>
-      <w:proofErr w:type="spellEnd"/>
-      <w:r>
-        <w:t xml:space="preserve">) were removed. This ensures that </w:t>
-      </w:r>
-      <w:proofErr w:type="spellStart"/>
-      <w:r>
-        <w:t>customer_surr_id</w:t>
-      </w:r>
-      <w:proofErr w:type="spellEnd"/>
-      <w:r>
-        <w:t xml:space="preserve"> is unique within the filtered table and can serve as a proper relationship key.</w:t>
+        <w:t xml:space="preserve"> one row for each version of their record as attributes changed over time. To allow a clean one-to-many relationship into the fact table, the table was filtered to active records only (is_active = 'Y') and the now-redundant versioning columns (start_dt, end_dt, is_active) were removed. This ensures that customer_surr_id is unique within the filtered table and can serve as a proper relationship key.</w:t>
       </w:r>
     </w:p>
     <w:p>
@@ -2817,63 +2681,7 @@
         <w:pStyle w:val="BodyText"/>
       </w:pPr>
       <w:r>
-        <w:t>The star schema centers on a Sales fact table (</w:t>
-      </w:r>
-      <w:proofErr w:type="spellStart"/>
-      <w:r>
-        <w:t>fct_sales_dd</w:t>
-      </w:r>
-      <w:proofErr w:type="spellEnd"/>
-      <w:r>
-        <w:t>) connected to six dimension tables: Date (</w:t>
-      </w:r>
-      <w:proofErr w:type="spellStart"/>
-      <w:r>
-        <w:t>dim_time_day</w:t>
-      </w:r>
-      <w:proofErr w:type="spellEnd"/>
-      <w:r>
-        <w:t>), Products (</w:t>
-      </w:r>
-      <w:proofErr w:type="spellStart"/>
-      <w:r>
-        <w:t>dim_products</w:t>
-      </w:r>
-      <w:proofErr w:type="spellEnd"/>
-      <w:r>
-        <w:t>), Customers (</w:t>
-      </w:r>
-      <w:proofErr w:type="spellStart"/>
-      <w:r>
-        <w:t>dim_customers_scd</w:t>
-      </w:r>
-      <w:proofErr w:type="spellEnd"/>
-      <w:r>
-        <w:t>), Geography (</w:t>
-      </w:r>
-      <w:proofErr w:type="spellStart"/>
-      <w:r>
-        <w:t>dim_geography</w:t>
-      </w:r>
-      <w:proofErr w:type="spellEnd"/>
-      <w:r>
-        <w:t>), Employees (</w:t>
-      </w:r>
-      <w:proofErr w:type="spellStart"/>
-      <w:r>
-        <w:t>dim_employees</w:t>
-      </w:r>
-      <w:proofErr w:type="spellEnd"/>
-      <w:r>
-        <w:t>), and Order Attributes (</w:t>
-      </w:r>
-      <w:proofErr w:type="spellStart"/>
-      <w:r>
-        <w:t>dim_order_attributes</w:t>
-      </w:r>
-      <w:proofErr w:type="spellEnd"/>
-      <w:r>
-        <w:t>).</w:t>
+        <w:t>The star schema centers on a Sales fact table (fct_sales_dd) connected to six dimension tables: Date (dim_time_day), Products (dim_products), Customers (dim_customers_scd), Geography (dim_geography), Employees (dim_employees), and Order Attributes (dim_order_attributes).</w:t>
       </w:r>
     </w:p>
     <w:p>
@@ -2889,43 +2697,13 @@
         <w:pStyle w:val="BodyText"/>
       </w:pPr>
       <w:r>
-        <w:t>Although the database enforces a foreign key between the fact and the dimension</w:t>
-      </w:r>
-      <w:r>
-        <w:t xml:space="preserve"> table</w:t>
-      </w:r>
-      <w:r>
-        <w:t>, a database-level constraint does not automatically guarantee a Power BI model relationship exists. If that link is missing silently</w:t>
-      </w:r>
-      <w:r>
-        <w:t>,</w:t>
-      </w:r>
-      <w:r>
-        <w:t xml:space="preserve"> due to mismatched data types after import, a table added after auto-detect ran, or any other reason</w:t>
-      </w:r>
-      <w:r>
-        <w:t>,</w:t>
-      </w:r>
-      <w:r>
-        <w:t xml:space="preserve"> </w:t>
-      </w:r>
-      <w:r>
-        <w:t>dimension table</w:t>
-      </w:r>
-      <w:r>
-        <w:t xml:space="preserve"> sits in the model with no relationship at all. When that happens, filtering by any other field has nothing to propagate into </w:t>
-      </w:r>
-      <w:r>
-        <w:t>dimensio</w:t>
+        <w:t>Although the database enforces a foreign key between the fact and the dimension table, a database-level constraint does not automatically guarantee a Power BI model relationship exists. If that link is missing silently, due to mismatched data types after import, a table added after auto-detect ran, or any other reason, dimension table sits in the model with no relationship at all. When that happens, filtering by any other field has nothing to propagate into dimensio</w:t>
       </w:r>
       <w:r>
         <w:t>n table</w:t>
       </w:r>
       <w:r>
-        <w:t>.</w:t>
-      </w:r>
-      <w:r>
-        <w:t xml:space="preserve"> </w:t>
+        <w:t xml:space="preserve">. </w:t>
       </w:r>
     </w:p>
     <w:p>
@@ -2959,15 +2737,7 @@
         <w:pStyle w:val="BodyText"/>
       </w:pPr>
       <w:r>
-        <w:t>The Customers relationship required manual creation altogether, since SCD2 dimensions intentionally have no database-level foreign key constraint (this is by design, to avoid cascade-delete complications during versioning). The relationship was created as Sales[</w:t>
-      </w:r>
-      <w:proofErr w:type="spellStart"/>
-      <w:r>
-        <w:t>customer_surr_id</w:t>
-      </w:r>
-      <w:proofErr w:type="spellEnd"/>
-      <w:r>
-        <w:t>]</w:t>
+        <w:t>The Customers relationship required manual creation altogether, since SCD2 dimensions intentionally have no database-level foreign key constraint (this is by design, to avoid cascade-delete complications during versioning). The relationship was created as Sales[customer_surr_id]</w:t>
       </w:r>
       <w:r>
         <w:t>-</w:t>
@@ -2985,15 +2755,7 @@
         <w:t xml:space="preserve"> </w:t>
       </w:r>
       <w:r>
-        <w:t>Customers[</w:t>
-      </w:r>
-      <w:proofErr w:type="spellStart"/>
-      <w:r>
-        <w:t>customer_surr_id</w:t>
-      </w:r>
-      <w:proofErr w:type="spellEnd"/>
-      <w:r>
-        <w:t>], Many-to-1, Single direction. This only works cleanly because the table was first filtered to active rows only in Power Query, giving the table a unique key that a relationship requires.</w:t>
+        <w:t>Customers[customer_surr_id], Many-to-1, Single direction. This only works cleanly because the table was first filtered to active rows only in Power Query, giving the table a unique key that a relationship requires.</w:t>
       </w:r>
     </w:p>
     <w:p>
@@ -3021,9 +2783,17 @@
           <w:sz w:val="20"/>
           <w:szCs w:val="20"/>
         </w:rPr>
-        <w:t xml:space="preserve">The Date table required special handling before being marked as the official Date Table. The default row (with </w:t>
-      </w:r>
-      <w:proofErr w:type="spellStart"/>
+        <w:t xml:space="preserve">The Date table required special handling before being marked as the official Date Table. The default row (with date_id = -1 and date value 1900-01-01) creates a 34-year gap between 1900 and the actual data range (2024–2025), which prevents Power BI from recognizing the table as a valid date table. This default row was filtered out in Power Query (Home </w:t>
+      </w:r>
+      <w:r>
+        <w:rPr>
+          <w:rFonts w:ascii="Arial" w:hAnsi="Arial" w:cs="Arial"/>
+          <w:bCs w:val="0"/>
+          <w:sz w:val="20"/>
+          <w:szCs w:val="20"/>
+        </w:rPr>
+        <w:t>&gt;</w:t>
+      </w:r>
       <w:r>
         <w:rPr>
           <w:rFonts w:ascii="Trebuchet MS" w:hAnsi="Trebuchet MS"/>
@@ -3031,9 +2801,17 @@
           <w:sz w:val="20"/>
           <w:szCs w:val="20"/>
         </w:rPr>
-        <w:t>date_id</w:t>
-      </w:r>
-      <w:proofErr w:type="spellEnd"/>
+        <w:t xml:space="preserve"> Reduce Rows </w:t>
+      </w:r>
+      <w:r>
+        <w:rPr>
+          <w:rFonts w:ascii="Arial" w:hAnsi="Arial" w:cs="Arial"/>
+          <w:bCs w:val="0"/>
+          <w:sz w:val="20"/>
+          <w:szCs w:val="20"/>
+        </w:rPr>
+        <w:t xml:space="preserve">&gt; </w:t>
+      </w:r>
       <w:r>
         <w:rPr>
           <w:rFonts w:ascii="Trebuchet MS" w:hAnsi="Trebuchet MS"/>
@@ -3041,42 +2819,6 @@
           <w:sz w:val="20"/>
           <w:szCs w:val="20"/>
         </w:rPr>
-        <w:t xml:space="preserve"> = -1 and date value 1900-01-01) creates a 34-year gap between 1900 and the actual data range (2024–2025), which prevents Power BI from recognizing the table as a valid date table. This default row was filtered out in Power Query (Home </w:t>
-      </w:r>
-      <w:r>
-        <w:rPr>
-          <w:rFonts w:ascii="Arial" w:hAnsi="Arial" w:cs="Arial"/>
-          <w:bCs w:val="0"/>
-          <w:sz w:val="20"/>
-          <w:szCs w:val="20"/>
-        </w:rPr>
-        <w:t>&gt;</w:t>
-      </w:r>
-      <w:r>
-        <w:rPr>
-          <w:rFonts w:ascii="Trebuchet MS" w:hAnsi="Trebuchet MS"/>
-          <w:bCs w:val="0"/>
-          <w:sz w:val="20"/>
-          <w:szCs w:val="20"/>
-        </w:rPr>
-        <w:t xml:space="preserve"> Reduce Rows </w:t>
-      </w:r>
-      <w:r>
-        <w:rPr>
-          <w:rFonts w:ascii="Arial" w:hAnsi="Arial" w:cs="Arial"/>
-          <w:bCs w:val="0"/>
-          <w:sz w:val="20"/>
-          <w:szCs w:val="20"/>
-        </w:rPr>
-        <w:t xml:space="preserve">&gt; </w:t>
-      </w:r>
-      <w:r>
-        <w:rPr>
-          <w:rFonts w:ascii="Trebuchet MS" w:hAnsi="Trebuchet MS"/>
-          <w:bCs w:val="0"/>
-          <w:sz w:val="20"/>
-          <w:szCs w:val="20"/>
-        </w:rPr>
         <w:t>Keep Rows, unchecking the -1 row) to create a continuous calendar with no gaps. Once filtered, the Date table was marked as the official Date Table on its "Date" column. This configuration is required for any time-intelligence DAX functions (TOTALYTD, PARALLELPERIOD, etc.) to evaluate correctly. The default rows in other dimension tables (Products, Customers, Geography, etc.) were retained, as they serve an important purpose: handling NULL or missing values in the source data by providing a surrogate key reference point.</w:t>
       </w:r>
     </w:p>
@@ -3093,95 +2835,7 @@
         <w:pStyle w:val="BodyText"/>
       </w:pPr>
       <w:r>
-        <w:t xml:space="preserve">The following technical surrogate keys and audit fields were hidden from the report view to avoid cluttering the interface for end users, while retaining their ability to drive relationships and sorting: </w:t>
-      </w:r>
-      <w:proofErr w:type="spellStart"/>
-      <w:r>
-        <w:t>date_id</w:t>
-      </w:r>
-      <w:proofErr w:type="spellEnd"/>
-      <w:r>
-        <w:t xml:space="preserve">, </w:t>
-      </w:r>
-      <w:proofErr w:type="spellStart"/>
-      <w:r>
-        <w:t>product_surr_id</w:t>
-      </w:r>
-      <w:proofErr w:type="spellEnd"/>
-      <w:r>
-        <w:t xml:space="preserve">, </w:t>
-      </w:r>
-      <w:proofErr w:type="spellStart"/>
-      <w:r>
-        <w:t>geography_surr_id</w:t>
-      </w:r>
-      <w:proofErr w:type="spellEnd"/>
-      <w:r>
-        <w:t xml:space="preserve">, </w:t>
-      </w:r>
-      <w:proofErr w:type="spellStart"/>
-      <w:r>
-        <w:t>employee_surr_id</w:t>
-      </w:r>
-      <w:proofErr w:type="spellEnd"/>
-      <w:r>
-        <w:t xml:space="preserve">, </w:t>
-      </w:r>
-      <w:proofErr w:type="spellStart"/>
-      <w:r>
-        <w:t>order_attr_surr_id</w:t>
-      </w:r>
-      <w:proofErr w:type="spellEnd"/>
-      <w:r>
-        <w:t xml:space="preserve">, </w:t>
-      </w:r>
-      <w:proofErr w:type="spellStart"/>
-      <w:r>
-        <w:t>customer_surr_id</w:t>
-      </w:r>
-      <w:proofErr w:type="spellEnd"/>
-      <w:r>
-        <w:t xml:space="preserve">, </w:t>
-      </w:r>
-      <w:proofErr w:type="spellStart"/>
-      <w:r>
-        <w:t>customer_src_id</w:t>
-      </w:r>
-      <w:proofErr w:type="spellEnd"/>
-      <w:r>
-        <w:t xml:space="preserve">, </w:t>
-      </w:r>
-      <w:proofErr w:type="spellStart"/>
-      <w:r>
-        <w:t>geography_src_id</w:t>
-      </w:r>
-      <w:proofErr w:type="spellEnd"/>
-      <w:r>
-        <w:t xml:space="preserve">, </w:t>
-      </w:r>
-      <w:proofErr w:type="spellStart"/>
-      <w:r>
-        <w:t>product_src_id</w:t>
-      </w:r>
-      <w:proofErr w:type="spellEnd"/>
-      <w:r>
-        <w:t xml:space="preserve">, </w:t>
-      </w:r>
-      <w:proofErr w:type="spellStart"/>
-      <w:r>
-        <w:t>employee_src_id</w:t>
-      </w:r>
-      <w:proofErr w:type="spellEnd"/>
-      <w:r>
-        <w:t xml:space="preserve">, and </w:t>
-      </w:r>
-      <w:proofErr w:type="spellStart"/>
-      <w:r>
-        <w:t>event_dt</w:t>
-      </w:r>
-      <w:proofErr w:type="spellEnd"/>
-      <w:r>
-        <w:t>.</w:t>
+        <w:t>The following technical surrogate keys and audit fields were hidden from the report view to avoid cluttering the interface for end users, while retaining their ability to drive relationships and sorting: date_id, product_surr_id, geography_surr_id, employee_surr_id, order_attr_surr_id, customer_surr_id, customer_src_id, geography_src_id, product_src_id, employee_src_id, and event_dt.</w:t>
       </w:r>
     </w:p>
     <w:p>
@@ -4332,7 +3986,6 @@
         </w:rPr>
         <w:t xml:space="preserve"> </w:t>
       </w:r>
-      <w:proofErr w:type="spellStart"/>
       <w:r>
         <w:rPr>
           <w:rFonts w:ascii="Consolas" w:hAnsi="Consolas"/>
@@ -4342,7 +3995,6 @@
         </w:rPr>
         <w:t>LatestDate</w:t>
       </w:r>
-      <w:proofErr w:type="spellEnd"/>
       <w:r>
         <w:rPr>
           <w:rFonts w:ascii="Consolas" w:hAnsi="Consolas"/>
@@ -4527,7 +4179,6 @@
         </w:rPr>
         <w:t xml:space="preserve"> = </w:t>
       </w:r>
-      <w:proofErr w:type="spellStart"/>
       <w:r>
         <w:rPr>
           <w:rFonts w:ascii="Consolas" w:hAnsi="Consolas"/>
@@ -4537,7 +4188,6 @@
         </w:rPr>
         <w:t>LatestDate</w:t>
       </w:r>
-      <w:proofErr w:type="spellEnd"/>
       <w:r>
         <w:rPr>
           <w:rFonts w:ascii="Consolas" w:hAnsi="Consolas"/>
@@ -4613,7 +4263,6 @@
         </w:rPr>
         <w:t xml:space="preserve"> </w:t>
       </w:r>
-      <w:proofErr w:type="spellStart"/>
       <w:r>
         <w:rPr>
           <w:rFonts w:ascii="Consolas" w:hAnsi="Consolas"/>
@@ -4623,7 +4272,6 @@
         </w:rPr>
         <w:t>CountryTable</w:t>
       </w:r>
-      <w:proofErr w:type="spellEnd"/>
       <w:r>
         <w:rPr>
           <w:rFonts w:ascii="Consolas" w:hAnsi="Consolas"/>
@@ -4760,27 +4408,7 @@
           <w:sz w:val="18"/>
           <w:szCs w:val="18"/>
         </w:rPr>
-        <w:t>"@</w:t>
-      </w:r>
-      <w:proofErr w:type="spellStart"/>
-      <w:r>
-        <w:rPr>
-          <w:rFonts w:ascii="Consolas" w:hAnsi="Consolas"/>
-          <w:color w:val="A31515"/>
-          <w:sz w:val="18"/>
-          <w:szCs w:val="18"/>
-        </w:rPr>
-        <w:t>CountrySales</w:t>
-      </w:r>
-      <w:proofErr w:type="spellEnd"/>
-      <w:r>
-        <w:rPr>
-          <w:rFonts w:ascii="Consolas" w:hAnsi="Consolas"/>
-          <w:color w:val="A31515"/>
-          <w:sz w:val="18"/>
-          <w:szCs w:val="18"/>
-        </w:rPr>
-        <w:t>"</w:t>
+        <w:t>"@CountrySales"</w:t>
       </w:r>
       <w:r>
         <w:rPr>
@@ -4880,7 +4508,6 @@
         </w:rPr>
         <w:t xml:space="preserve"> </w:t>
       </w:r>
-      <w:proofErr w:type="spellStart"/>
       <w:r>
         <w:rPr>
           <w:rFonts w:ascii="Consolas" w:hAnsi="Consolas"/>
@@ -4890,7 +4517,6 @@
         </w:rPr>
         <w:t>TopCountry</w:t>
       </w:r>
-      <w:proofErr w:type="spellEnd"/>
       <w:r>
         <w:rPr>
           <w:rFonts w:ascii="Consolas" w:hAnsi="Consolas"/>
@@ -4936,7 +4562,6 @@
         </w:rPr>
         <w:t xml:space="preserve">, </w:t>
       </w:r>
-      <w:proofErr w:type="spellStart"/>
       <w:r>
         <w:rPr>
           <w:rFonts w:ascii="Consolas" w:hAnsi="Consolas"/>
@@ -4946,7 +4571,6 @@
         </w:rPr>
         <w:t>CountryTable</w:t>
       </w:r>
-      <w:proofErr w:type="spellEnd"/>
       <w:r>
         <w:rPr>
           <w:rFonts w:ascii="Consolas" w:hAnsi="Consolas"/>
@@ -5055,7 +4679,6 @@
         </w:rPr>
         <w:t>(</w:t>
       </w:r>
-      <w:proofErr w:type="spellStart"/>
       <w:r>
         <w:rPr>
           <w:rFonts w:ascii="Consolas" w:hAnsi="Consolas"/>
@@ -5065,7 +4688,6 @@
         </w:rPr>
         <w:t>TopCountry</w:t>
       </w:r>
-      <w:proofErr w:type="spellEnd"/>
       <w:r>
         <w:rPr>
           <w:rFonts w:ascii="Consolas" w:hAnsi="Consolas"/>
@@ -5159,7 +4781,6 @@
         </w:rPr>
         <w:t xml:space="preserve">VAR </w:t>
       </w:r>
-      <w:proofErr w:type="spellStart"/>
       <w:r>
         <w:rPr>
           <w:rFonts w:ascii="Consolas" w:hAnsi="Consolas"/>
@@ -5176,17 +4797,7 @@
           <w:sz w:val="18"/>
           <w:szCs w:val="18"/>
         </w:rPr>
-        <w:t>ountryTable</w:t>
-      </w:r>
-      <w:proofErr w:type="spellEnd"/>
-      <w:r>
-        <w:rPr>
-          <w:rFonts w:ascii="Consolas" w:hAnsi="Consolas"/>
-          <w:color w:val="008080"/>
-          <w:sz w:val="18"/>
-          <w:szCs w:val="18"/>
-        </w:rPr>
-        <w:t xml:space="preserve"> </w:t>
+        <w:t xml:space="preserve">ountryTable </w:t>
       </w:r>
       <w:r>
         <w:rPr>
@@ -5306,27 +4917,7 @@
           <w:sz w:val="18"/>
           <w:szCs w:val="18"/>
         </w:rPr>
-        <w:t>"@</w:t>
-      </w:r>
-      <w:proofErr w:type="spellStart"/>
-      <w:r>
-        <w:rPr>
-          <w:rFonts w:ascii="Consolas" w:hAnsi="Consolas"/>
-          <w:color w:val="A31515"/>
-          <w:sz w:val="18"/>
-          <w:szCs w:val="18"/>
-        </w:rPr>
-        <w:t>CountrySales</w:t>
-      </w:r>
-      <w:proofErr w:type="spellEnd"/>
-      <w:r>
-        <w:rPr>
-          <w:rFonts w:ascii="Consolas" w:hAnsi="Consolas"/>
-          <w:color w:val="A31515"/>
-          <w:sz w:val="18"/>
-          <w:szCs w:val="18"/>
-        </w:rPr>
-        <w:t>", CA</w:t>
+        <w:t>"@CountrySales", CA</w:t>
       </w:r>
       <w:r>
         <w:rPr>
@@ -5415,17 +5006,7 @@
           <w:sz w:val="18"/>
           <w:szCs w:val="18"/>
         </w:rPr>
-        <w:t xml:space="preserve"> </w:t>
-      </w:r>
-      <w:proofErr w:type="spellStart"/>
-      <w:r>
-        <w:rPr>
-          <w:rFonts w:ascii="Consolas" w:hAnsi="Consolas"/>
-          <w:color w:val="000000"/>
-          <w:sz w:val="18"/>
-          <w:szCs w:val="18"/>
-        </w:rPr>
-        <w:t>To</w:t>
+        <w:t xml:space="preserve"> To</w:t>
       </w:r>
       <w:r>
         <w:rPr>
@@ -5452,9 +5033,62 @@
           <w:sz w:val="18"/>
           <w:szCs w:val="18"/>
         </w:rPr>
-        <w:t>ntry</w:t>
-      </w:r>
-      <w:proofErr w:type="spellEnd"/>
+        <w:t>ntry = TOP</w:t>
+      </w:r>
+      <w:r>
+        <w:rPr>
+          <w:rFonts w:ascii="Consolas" w:hAnsi="Consolas"/>
+          <w:color w:val="000000"/>
+          <w:sz w:val="18"/>
+          <w:szCs w:val="18"/>
+        </w:rPr>
+        <w:t>N(</w:t>
+      </w:r>
+      <w:r>
+        <w:rPr>
+          <w:rFonts w:ascii="Consolas" w:hAnsi="Consolas"/>
+          <w:color w:val="098658"/>
+          <w:sz w:val="18"/>
+          <w:szCs w:val="18"/>
+        </w:rPr>
+        <w:t>1</w:t>
+      </w:r>
+      <w:r>
+        <w:rPr>
+          <w:rFonts w:ascii="Consolas" w:hAnsi="Consolas"/>
+          <w:color w:val="3165BB"/>
+          <w:sz w:val="18"/>
+          <w:szCs w:val="18"/>
+        </w:rPr>
+        <w:t>, Co</w:t>
+      </w:r>
+      <w:r>
+        <w:rPr>
+          <w:rFonts w:ascii="Consolas" w:hAnsi="Consolas"/>
+          <w:color w:val="000000"/>
+          <w:sz w:val="18"/>
+          <w:szCs w:val="18"/>
+        </w:rPr>
+        <w:t>u</w:t>
+      </w:r>
+      <w:r>
+        <w:rPr>
+          <w:rFonts w:ascii="Consolas" w:hAnsi="Consolas"/>
+          <w:color w:val="098658"/>
+          <w:sz w:val="18"/>
+          <w:szCs w:val="18"/>
+        </w:rPr>
+        <w:t>n</w:t>
+      </w:r>
+      <w:r>
+        <w:rPr>
+          <w:rFonts w:ascii="Consolas" w:hAnsi="Consolas"/>
+          <w:color w:val="000000"/>
+          <w:sz w:val="18"/>
+          <w:szCs w:val="18"/>
+        </w:rPr>
+        <w:t>tr</w:t>
+      </w:r>
       <w:r>
         <w:rPr>
           <w:rFonts w:ascii="Consolas" w:hAnsi="Consolas"/>
@@ -5462,90 +5096,7 @@
           <w:sz w:val="18"/>
           <w:szCs w:val="18"/>
         </w:rPr>
-        <w:t xml:space="preserve"> = TOP</w:t>
-      </w:r>
-      <w:r>
-        <w:rPr>
-          <w:rFonts w:ascii="Consolas" w:hAnsi="Consolas"/>
-          <w:color w:val="000000"/>
-          <w:sz w:val="18"/>
-          <w:szCs w:val="18"/>
-        </w:rPr>
-        <w:t>N(</w:t>
-      </w:r>
-      <w:r>
-        <w:rPr>
-          <w:rFonts w:ascii="Consolas" w:hAnsi="Consolas"/>
-          <w:color w:val="098658"/>
-          <w:sz w:val="18"/>
-          <w:szCs w:val="18"/>
-        </w:rPr>
-        <w:t>1</w:t>
-      </w:r>
-      <w:r>
-        <w:rPr>
-          <w:rFonts w:ascii="Consolas" w:hAnsi="Consolas"/>
-          <w:color w:val="3165BB"/>
-          <w:sz w:val="18"/>
-          <w:szCs w:val="18"/>
-        </w:rPr>
-        <w:t xml:space="preserve">, </w:t>
-      </w:r>
-      <w:proofErr w:type="spellStart"/>
-      <w:r>
-        <w:rPr>
-          <w:rFonts w:ascii="Consolas" w:hAnsi="Consolas"/>
-          <w:color w:val="3165BB"/>
-          <w:sz w:val="18"/>
-          <w:szCs w:val="18"/>
-        </w:rPr>
-        <w:t>Co</w:t>
-      </w:r>
-      <w:r>
-        <w:rPr>
-          <w:rFonts w:ascii="Consolas" w:hAnsi="Consolas"/>
-          <w:color w:val="000000"/>
-          <w:sz w:val="18"/>
-          <w:szCs w:val="18"/>
-        </w:rPr>
-        <w:t>u</w:t>
-      </w:r>
-      <w:r>
-        <w:rPr>
-          <w:rFonts w:ascii="Consolas" w:hAnsi="Consolas"/>
-          <w:color w:val="098658"/>
-          <w:sz w:val="18"/>
-          <w:szCs w:val="18"/>
-        </w:rPr>
-        <w:t>n</w:t>
-      </w:r>
-      <w:r>
-        <w:rPr>
-          <w:rFonts w:ascii="Consolas" w:hAnsi="Consolas"/>
-          <w:color w:val="000000"/>
-          <w:sz w:val="18"/>
-          <w:szCs w:val="18"/>
-        </w:rPr>
-        <w:t>tr</w:t>
-      </w:r>
-      <w:r>
-        <w:rPr>
-          <w:rFonts w:ascii="Consolas" w:hAnsi="Consolas"/>
-          <w:color w:val="008080"/>
-          <w:sz w:val="18"/>
-          <w:szCs w:val="18"/>
-        </w:rPr>
-        <w:t>yTable</w:t>
-      </w:r>
-      <w:proofErr w:type="spellEnd"/>
-      <w:r>
-        <w:rPr>
-          <w:rFonts w:ascii="Consolas" w:hAnsi="Consolas"/>
-          <w:color w:val="008080"/>
-          <w:sz w:val="18"/>
-          <w:szCs w:val="18"/>
-        </w:rPr>
-        <w:t>, [@Co</w:t>
+        <w:t>yTable, [@Co</w:t>
       </w:r>
       <w:r>
         <w:rPr>
@@ -5634,17 +5185,7 @@
           <w:sz w:val="18"/>
           <w:szCs w:val="18"/>
         </w:rPr>
-        <w:t>XX(</w:t>
-      </w:r>
-      <w:proofErr w:type="spellStart"/>
-      <w:r>
-        <w:rPr>
-          <w:rFonts w:ascii="Consolas" w:hAnsi="Consolas"/>
-          <w:color w:val="000000"/>
-          <w:sz w:val="18"/>
-          <w:szCs w:val="18"/>
-        </w:rPr>
-        <w:t>Top</w:t>
+        <w:t>XX(Top</w:t>
       </w:r>
       <w:r>
         <w:rPr>
@@ -5671,17 +5212,7 @@
           <w:sz w:val="18"/>
           <w:szCs w:val="18"/>
         </w:rPr>
-        <w:t>ry</w:t>
-      </w:r>
-      <w:proofErr w:type="spellEnd"/>
-      <w:r>
-        <w:rPr>
-          <w:rFonts w:ascii="Consolas" w:hAnsi="Consolas"/>
-          <w:color w:val="008080"/>
-          <w:sz w:val="18"/>
-          <w:szCs w:val="18"/>
-        </w:rPr>
-        <w:t>, Geogra</w:t>
+        <w:t>ry, Geogra</w:t>
       </w:r>
       <w:r>
         <w:rPr>
@@ -5782,7 +5313,6 @@
         </w:rPr>
         <w:t xml:space="preserve"> </w:t>
       </w:r>
-      <w:proofErr w:type="spellStart"/>
       <w:r>
         <w:rPr>
           <w:rFonts w:ascii="Consolas" w:hAnsi="Consolas"/>
@@ -5792,7 +5322,6 @@
         </w:rPr>
         <w:t>MonthCategoryTotal</w:t>
       </w:r>
-      <w:proofErr w:type="spellEnd"/>
       <w:r>
         <w:rPr>
           <w:rFonts w:ascii="Consolas" w:hAnsi="Consolas"/>
@@ -6132,7 +5661,6 @@
         </w:rPr>
         <w:t xml:space="preserve">, </w:t>
       </w:r>
-      <w:proofErr w:type="spellStart"/>
       <w:r>
         <w:rPr>
           <w:rFonts w:ascii="Consolas" w:hAnsi="Consolas"/>
@@ -6142,7 +5670,6 @@
         </w:rPr>
         <w:t>MonthCategoryTotal</w:t>
       </w:r>
-      <w:proofErr w:type="spellEnd"/>
       <w:r>
         <w:rPr>
           <w:rFonts w:ascii="Consolas" w:hAnsi="Consolas"/>
@@ -6221,7 +5748,6 @@
         </w:rPr>
         <w:t xml:space="preserve"> </w:t>
       </w:r>
-      <w:proofErr w:type="spellStart"/>
       <w:r>
         <w:rPr>
           <w:rFonts w:ascii="Consolas" w:hAnsi="Consolas"/>
@@ -6231,7 +5757,6 @@
         </w:rPr>
         <w:t>LatestYear</w:t>
       </w:r>
-      <w:proofErr w:type="spellEnd"/>
       <w:r>
         <w:rPr>
           <w:rFonts w:ascii="Consolas" w:hAnsi="Consolas"/>
@@ -6416,7 +5941,6 @@
         </w:rPr>
         <w:t xml:space="preserve"> = </w:t>
       </w:r>
-      <w:proofErr w:type="spellStart"/>
       <w:r>
         <w:rPr>
           <w:rFonts w:ascii="Consolas" w:hAnsi="Consolas"/>
@@ -6426,7 +5950,6 @@
         </w:rPr>
         <w:t>LatestYear</w:t>
       </w:r>
-      <w:proofErr w:type="spellEnd"/>
       <w:r>
         <w:rPr>
           <w:rFonts w:ascii="Consolas" w:hAnsi="Consolas"/>
@@ -6494,7 +6017,6 @@
         </w:rPr>
         <w:t xml:space="preserve"> </w:t>
       </w:r>
-      <w:proofErr w:type="spellStart"/>
       <w:r>
         <w:rPr>
           <w:rFonts w:ascii="Consolas" w:hAnsi="Consolas"/>
@@ -6504,7 +6026,6 @@
         </w:rPr>
         <w:t>LatestYear</w:t>
       </w:r>
-      <w:proofErr w:type="spellEnd"/>
       <w:r>
         <w:rPr>
           <w:rFonts w:ascii="Consolas" w:hAnsi="Consolas"/>
@@ -6635,7 +6156,6 @@
         </w:rPr>
         <w:t xml:space="preserve"> </w:t>
       </w:r>
-      <w:proofErr w:type="spellStart"/>
       <w:r>
         <w:rPr>
           <w:rFonts w:ascii="Consolas" w:hAnsi="Consolas"/>
@@ -6645,7 +6165,6 @@
         </w:rPr>
         <w:t>PriorYear</w:t>
       </w:r>
-      <w:proofErr w:type="spellEnd"/>
       <w:r>
         <w:rPr>
           <w:rFonts w:ascii="Consolas" w:hAnsi="Consolas"/>
@@ -6691,7 +6210,6 @@
         </w:rPr>
         <w:t>(</w:t>
       </w:r>
-      <w:proofErr w:type="spellStart"/>
       <w:r>
         <w:rPr>
           <w:rFonts w:ascii="Consolas" w:hAnsi="Consolas"/>
@@ -6701,7 +6219,6 @@
         </w:rPr>
         <w:t>LatestYear</w:t>
       </w:r>
-      <w:proofErr w:type="spellEnd"/>
       <w:r>
         <w:rPr>
           <w:rFonts w:ascii="Consolas" w:hAnsi="Consolas"/>
@@ -6832,7 +6349,6 @@
         </w:rPr>
         <w:t xml:space="preserve"> = </w:t>
       </w:r>
-      <w:proofErr w:type="spellStart"/>
       <w:r>
         <w:rPr>
           <w:rFonts w:ascii="Consolas" w:hAnsi="Consolas"/>
@@ -6842,7 +6358,6 @@
         </w:rPr>
         <w:t>PriorYear</w:t>
       </w:r>
-      <w:proofErr w:type="spellEnd"/>
       <w:r>
         <w:rPr>
           <w:rFonts w:ascii="Consolas" w:hAnsi="Consolas"/>
@@ -6857,14 +6372,9 @@
       <w:pPr>
         <w:pStyle w:val="CommentSubject"/>
       </w:pPr>
-      <w:proofErr w:type="spellStart"/>
       <w:r>
         <w:lastRenderedPageBreak/>
-        <w:t>Drillthrough</w:t>
-      </w:r>
-      <w:proofErr w:type="spellEnd"/>
-      <w:r>
-        <w:t xml:space="preserve"> Country</w:t>
+        <w:t>Drillthrough Country</w:t>
       </w:r>
     </w:p>
     <w:p>
@@ -6879,7 +6389,6 @@
           <w:szCs w:val="18"/>
         </w:rPr>
       </w:pPr>
-      <w:proofErr w:type="spellStart"/>
       <w:r>
         <w:rPr>
           <w:rFonts w:ascii="Consolas" w:hAnsi="Consolas"/>
@@ -6888,77 +6397,66 @@
           <w:szCs w:val="18"/>
           <w:shd w:val="clear" w:color="auto" w:fill="E7E6E6" w:themeFill="background2"/>
         </w:rPr>
-        <w:t>Drillthrough</w:t>
-      </w:r>
-      <w:proofErr w:type="spellEnd"/>
-      <w:r>
-        <w:rPr>
-          <w:rFonts w:ascii="Consolas" w:hAnsi="Consolas"/>
-          <w:color w:val="000000"/>
+        <w:t xml:space="preserve">Drillthrough Country = </w:t>
+      </w:r>
+      <w:r>
+        <w:rPr>
+          <w:rFonts w:ascii="Consolas" w:hAnsi="Consolas"/>
+          <w:color w:val="3165BB"/>
           <w:sz w:val="18"/>
           <w:szCs w:val="18"/>
           <w:shd w:val="clear" w:color="auto" w:fill="E7E6E6" w:themeFill="background2"/>
         </w:rPr>
-        <w:t xml:space="preserve"> Country = </w:t>
-      </w:r>
-      <w:r>
-        <w:rPr>
-          <w:rFonts w:ascii="Consolas" w:hAnsi="Consolas"/>
-          <w:color w:val="3165BB"/>
+        <w:t>SELECTEDVALUE</w:t>
+      </w:r>
+      <w:r>
+        <w:rPr>
+          <w:rFonts w:ascii="Consolas" w:hAnsi="Consolas"/>
+          <w:color w:val="000000"/>
           <w:sz w:val="18"/>
           <w:szCs w:val="18"/>
           <w:shd w:val="clear" w:color="auto" w:fill="E7E6E6" w:themeFill="background2"/>
         </w:rPr>
-        <w:t>SELECTEDVALUE</w:t>
-      </w:r>
-      <w:r>
-        <w:rPr>
-          <w:rFonts w:ascii="Consolas" w:hAnsi="Consolas"/>
-          <w:color w:val="000000"/>
+        <w:t>(</w:t>
+      </w:r>
+      <w:r>
+        <w:rPr>
+          <w:rFonts w:ascii="Consolas" w:hAnsi="Consolas"/>
+          <w:color w:val="001080"/>
           <w:sz w:val="18"/>
           <w:szCs w:val="18"/>
           <w:shd w:val="clear" w:color="auto" w:fill="E7E6E6" w:themeFill="background2"/>
         </w:rPr>
-        <w:t>(</w:t>
-      </w:r>
-      <w:r>
-        <w:rPr>
-          <w:rFonts w:ascii="Consolas" w:hAnsi="Consolas"/>
-          <w:color w:val="001080"/>
+        <w:t>Geography[Country]</w:t>
+      </w:r>
+      <w:r>
+        <w:rPr>
+          <w:rFonts w:ascii="Consolas" w:hAnsi="Consolas"/>
+          <w:color w:val="000000"/>
           <w:sz w:val="18"/>
           <w:szCs w:val="18"/>
           <w:shd w:val="clear" w:color="auto" w:fill="E7E6E6" w:themeFill="background2"/>
         </w:rPr>
-        <w:t>Geography[Country]</w:t>
-      </w:r>
-      <w:r>
-        <w:rPr>
-          <w:rFonts w:ascii="Consolas" w:hAnsi="Consolas"/>
-          <w:color w:val="000000"/>
+        <w:t xml:space="preserve">, </w:t>
+      </w:r>
+      <w:r>
+        <w:rPr>
+          <w:rFonts w:ascii="Consolas" w:hAnsi="Consolas"/>
+          <w:color w:val="A31515"/>
           <w:sz w:val="18"/>
           <w:szCs w:val="18"/>
           <w:shd w:val="clear" w:color="auto" w:fill="E7E6E6" w:themeFill="background2"/>
         </w:rPr>
-        <w:t xml:space="preserve">, </w:t>
-      </w:r>
-      <w:r>
-        <w:rPr>
-          <w:rFonts w:ascii="Consolas" w:hAnsi="Consolas"/>
-          <w:color w:val="A31515"/>
+        <w:t>"All Countries"</w:t>
+      </w:r>
+      <w:r>
+        <w:rPr>
+          <w:rFonts w:ascii="Consolas" w:hAnsi="Consolas"/>
+          <w:color w:val="000000"/>
           <w:sz w:val="18"/>
           <w:szCs w:val="18"/>
           <w:shd w:val="clear" w:color="auto" w:fill="E7E6E6" w:themeFill="background2"/>
         </w:rPr>
-        <w:t>"All Countries"</w:t>
-      </w:r>
-      <w:r>
-        <w:rPr>
-          <w:rFonts w:ascii="Consolas" w:hAnsi="Consolas"/>
-          <w:color w:val="000000"/>
-          <w:sz w:val="18"/>
-          <w:szCs w:val="18"/>
-          <w:shd w:val="clear" w:color="auto" w:fill="E7E6E6" w:themeFill="background2"/>
-        </w:rPr>
         <w:t>)</w:t>
       </w:r>
     </w:p>
@@ -6967,15 +6465,7 @@
         <w:pStyle w:val="BodyText"/>
       </w:pPr>
       <w:r>
-        <w:t xml:space="preserve">Displays the currently selected country on the Country Details </w:t>
-      </w:r>
-      <w:proofErr w:type="spellStart"/>
-      <w:r>
-        <w:t>drillthrough</w:t>
-      </w:r>
-      <w:proofErr w:type="spellEnd"/>
-      <w:r>
-        <w:t xml:space="preserve"> page. When a user drills through from the map on the Overview page by right-clicking a country, this measure returns the name of that country.</w:t>
+        <w:t>Displays the currently selected country on the Country Details drillthrough page. When a user drills through from the map on the Overview page by right-clicking a country, this measure returns the name of that country.</w:t>
       </w:r>
     </w:p>
     <w:p>
@@ -7112,15 +6602,7 @@
         <w:pStyle w:val="BodyText"/>
       </w:pPr>
       <w:r>
-        <w:t xml:space="preserve">The report consists of three visible pages (Overview, Products &amp; Categories, Customers &amp; Markets) plus two hidden pages supporting </w:t>
-      </w:r>
-      <w:proofErr w:type="spellStart"/>
-      <w:r>
-        <w:t>drillthrough</w:t>
-      </w:r>
-      <w:proofErr w:type="spellEnd"/>
-      <w:r>
-        <w:t xml:space="preserve"> and custom tooltips. All visible pages share a consistent header band containing the logo (top-left), page title (top-center), and a three-button page navigator (top-right). All pages use a 16:9 (1600×900) canvas size and share a unified slicer rail on the left side (Year, Category, Segment, Market) configured to sync across pages</w:t>
+        <w:t>The report consists of three visible pages (Overview, Products &amp; Categories, Customers &amp; Markets) plus two hidden pages supporting drillthrough and custom tooltips. All visible pages share a consistent header band containing the logo (top-left), page title (top-center), and a three-button page navigator (top-right). All pages use a 16:9 (1600×900) canvas size and share a unified slicer rail on the left side (Year, Category, Segment, Market) configured to sync across pages</w:t>
       </w:r>
       <w:r>
         <w:t>,</w:t>
@@ -7171,6 +6653,9 @@
         <w:keepNext/>
       </w:pPr>
       <w:r>
+        <w:rPr>
+          <w:noProof/>
+        </w:rPr>
         <w:drawing>
           <wp:inline distT="0" distB="0" distL="0" distR="0" wp14:anchorId="7D2CD179" wp14:editId="007348BC">
             <wp:extent cx="5905499" cy="3346450"/>
@@ -7368,6 +6853,9 @@
         <w:ind w:left="720" w:hanging="360"/>
       </w:pPr>
       <w:r>
+        <w:rPr>
+          <w:noProof/>
+        </w:rPr>
         <w:drawing>
           <wp:inline distT="0" distB="0" distL="0" distR="0" wp14:anchorId="210CCAA6" wp14:editId="4FC601D0">
             <wp:extent cx="2707498" cy="2105025"/>
@@ -7405,6 +6893,9 @@
         </w:drawing>
       </w:r>
       <w:r>
+        <w:rPr>
+          <w:noProof/>
+        </w:rPr>
         <w:drawing>
           <wp:inline distT="0" distB="0" distL="0" distR="0" wp14:anchorId="111595E4" wp14:editId="1F251239">
             <wp:extent cx="2647950" cy="2085616"/>
@@ -7490,15 +6981,7 @@
         </w:numPr>
       </w:pPr>
       <w:r>
-        <w:t>Bar chart (Sales by Discount Band): Shows Total Sales Amount broken down by Discount Band (the calculated column): No Discount, Low 0–20%, Medium 20–40%, High 40%+), offering a stable, interpretable view of discounting patterns. The "</w:t>
-      </w:r>
-      <w:proofErr w:type="spellStart"/>
-      <w:r>
-        <w:t>n.a.</w:t>
-      </w:r>
-      <w:proofErr w:type="spellEnd"/>
-      <w:r>
-        <w:t>" values (representing null/missing segment data in the source) were filtered out for a cleaner visual.</w:t>
+        <w:t>Bar chart (Sales by Discount Band): Shows Total Sales Amount broken down by Discount Band (the calculated column): No Discount, Low 0–20%, Medium 20–40%, High 40%+), offering a stable, interpretable view of discounting patterns. The "n.a." values (representing null/missing segment data in the source) were filtered out for a cleaner visual.</w:t>
       </w:r>
     </w:p>
     <w:p>
@@ -7532,6 +7015,9 @@
         <w:keepNext/>
       </w:pPr>
       <w:r>
+        <w:rPr>
+          <w:noProof/>
+        </w:rPr>
         <w:drawing>
           <wp:inline distT="0" distB="0" distL="0" distR="0" wp14:anchorId="1A10B466" wp14:editId="0A658CB2">
             <wp:extent cx="5941695" cy="3380740"/>
@@ -7663,15 +7149,7 @@
         </w:numPr>
       </w:pPr>
       <w:r>
-        <w:t>Bar chart (Sales by Ship Mode): Displays Total Sales Amount broken down by Ship Mode (Standard Class, Second Class, First Class, Same Day). The "</w:t>
-      </w:r>
-      <w:proofErr w:type="spellStart"/>
-      <w:r>
-        <w:t>n.a.</w:t>
-      </w:r>
-      <w:proofErr w:type="spellEnd"/>
-      <w:r>
-        <w:t>" bar (representing international orders, which do not carry Ship Mode data in the source system) was filtered out in the visual's filter pane. This chart helps fulfillment teams understand which shipping modes handle the volume and cost implications.</w:t>
+        <w:t>Bar chart (Sales by Ship Mode): Displays Total Sales Amount broken down by Ship Mode (Standard Class, Second Class, First Class, Same Day). The "n.a." bar (representing international orders, which do not carry Ship Mode data in the source system) was filtered out in the visual's filter pane. This chart helps fulfillment teams understand which shipping modes handle the volume and cost implications.</w:t>
       </w:r>
     </w:p>
     <w:p>
@@ -7716,6 +7194,9 @@
         <w:keepNext/>
       </w:pPr>
       <w:r>
+        <w:rPr>
+          <w:noProof/>
+        </w:rPr>
         <w:lastRenderedPageBreak/>
         <w:drawing>
           <wp:inline distT="0" distB="0" distL="0" distR="0" wp14:anchorId="716CE7A3" wp14:editId="324A63E8">
@@ -7881,6 +7362,9 @@
         <w:keepNext/>
       </w:pPr>
       <w:r>
+        <w:rPr>
+          <w:noProof/>
+        </w:rPr>
         <w:lastRenderedPageBreak/>
         <w:drawing>
           <wp:inline distT="0" distB="0" distL="0" distR="0" wp14:anchorId="5D9123F4" wp14:editId="60494204">
@@ -7953,6 +7437,7 @@
       <w:r>
         <w:rPr>
           <w:rFonts w:ascii="Trebuchet MS" w:hAnsi="Trebuchet MS"/>
+          <w:noProof/>
         </w:rPr>
         <w:t>5</w:t>
       </w:r>
@@ -8006,10 +7491,7 @@
         <w:pStyle w:val="CommentSubject"/>
       </w:pPr>
       <w:r>
-        <w:t>Page Navigation</w:t>
-      </w:r>
-      <w:r>
-        <w:t>:</w:t>
+        <w:t>Page Navigation:</w:t>
       </w:r>
     </w:p>
     <w:p>
@@ -8017,13 +7499,7 @@
         <w:pStyle w:val="BodyText"/>
       </w:pPr>
       <w:r>
-        <w:t>A three-butt</w:t>
-      </w:r>
-      <w:r>
-        <w:t>o</w:t>
-      </w:r>
-      <w:r>
-        <w:t xml:space="preserve">n page navigator (inserted via </w:t>
+        <w:t xml:space="preserve">A three-button page navigator (inserted via </w:t>
       </w:r>
       <w:r>
         <w:t xml:space="preserve">Insert </w:t>
@@ -8065,6 +7541,9 @@
         <w:keepNext/>
       </w:pPr>
       <w:r>
+        <w:rPr>
+          <w:noProof/>
+        </w:rPr>
         <w:drawing>
           <wp:inline distT="0" distB="0" distL="0" distR="0" wp14:anchorId="66A23869" wp14:editId="785AF70C">
             <wp:extent cx="4420217" cy="647790"/>
@@ -8213,6 +7692,9 @@
         <w:keepNext/>
       </w:pPr>
       <w:r>
+        <w:rPr>
+          <w:noProof/>
+        </w:rPr>
         <w:drawing>
           <wp:inline distT="0" distB="0" distL="0" distR="0" wp14:anchorId="7B2E9B1F" wp14:editId="346B82CE">
             <wp:extent cx="5941695" cy="3471545"/>
@@ -8305,13 +7787,8 @@
       <w:pPr>
         <w:pStyle w:val="CommentSubject"/>
       </w:pPr>
-      <w:proofErr w:type="spellStart"/>
-      <w:r>
-        <w:t>Drillthrough</w:t>
-      </w:r>
-      <w:proofErr w:type="spellEnd"/>
-      <w:r>
-        <w:t xml:space="preserve"> (Country Details):</w:t>
+      <w:r>
+        <w:t>Drillthrough (Country Details):</w:t>
       </w:r>
     </w:p>
     <w:p>
@@ -8319,48 +7796,16 @@
         <w:pStyle w:val="BodyText"/>
       </w:pPr>
       <w:r>
-        <w:t xml:space="preserve">A hidden page called "Country Details" was created as a </w:t>
-      </w:r>
-      <w:proofErr w:type="spellStart"/>
-      <w:r>
-        <w:t>drillthrough</w:t>
-      </w:r>
-      <w:proofErr w:type="spellEnd"/>
-      <w:r>
-        <w:t xml:space="preserve"> target. The page is configured as a </w:t>
-      </w:r>
-      <w:proofErr w:type="spellStart"/>
-      <w:r>
-        <w:t>drillthrough</w:t>
-      </w:r>
-      <w:proofErr w:type="spellEnd"/>
-      <w:r>
-        <w:t xml:space="preserve"> page </w:t>
+        <w:t xml:space="preserve">A hidden page called "Country Details" was created as a drillthrough target. The page is configured as a drillthrough page </w:t>
       </w:r>
       <w:r>
         <w:t xml:space="preserve">with </w:t>
       </w:r>
       <w:r>
-        <w:t xml:space="preserve">Geography[Country] added to the </w:t>
-      </w:r>
-      <w:proofErr w:type="spellStart"/>
-      <w:r>
-        <w:t>Drillthrough</w:t>
-      </w:r>
-      <w:proofErr w:type="spellEnd"/>
-      <w:r>
-        <w:t xml:space="preserve"> filters well. The page contains a back button (auto-added by Power BI), two KPI cards displaying Total Sales Amount and Total Profit filtered to the selected country, a table of top products sold in that country (sorted descending by sales), and a table of top customers in that country (sorted descending by sales). </w:t>
-      </w:r>
-      <w:r>
-        <w:t xml:space="preserve">At the top of the page, a filter indicator displays the currently selected country via a Card visual bound to the </w:t>
-      </w:r>
-      <w:proofErr w:type="spellStart"/>
-      <w:r>
-        <w:t>Drillthrough</w:t>
-      </w:r>
-      <w:proofErr w:type="spellEnd"/>
-      <w:r>
-        <w:t xml:space="preserve"> Country measure (defined as </w:t>
+        <w:t xml:space="preserve">Geography[Country] added to the Drillthrough filters well. The page contains a back button (auto-added by Power BI), two KPI cards displaying Total Sales Amount and Total Profit filtered to the selected country, a table of top products sold in that country (sorted descending by sales), and a table of top customers in that country (sorted descending by sales). </w:t>
+      </w:r>
+      <w:r>
+        <w:t xml:space="preserve">At the top of the page, a filter indicator displays the currently selected country via a Card visual bound to the Drillthrough Country measure (defined as </w:t>
       </w:r>
       <w:r>
         <w:rPr>
@@ -8384,15 +7829,7 @@
         <w:t>&gt;</w:t>
       </w:r>
       <w:r>
-        <w:t xml:space="preserve"> </w:t>
-      </w:r>
-      <w:proofErr w:type="spellStart"/>
-      <w:r>
-        <w:t>Drillthrough</w:t>
-      </w:r>
-      <w:proofErr w:type="spellEnd"/>
-      <w:r>
-        <w:t xml:space="preserve"> </w:t>
+        <w:t xml:space="preserve"> Drillthrough </w:t>
       </w:r>
       <w:r>
         <w:rPr>
@@ -8410,6 +7847,9 @@
         <w:keepNext/>
       </w:pPr>
       <w:r>
+        <w:rPr>
+          <w:noProof/>
+        </w:rPr>
         <w:lastRenderedPageBreak/>
         <w:drawing>
           <wp:inline distT="0" distB="0" distL="0" distR="0" wp14:anchorId="6E72F2C2" wp14:editId="61C08403">
@@ -8496,23 +7936,226 @@
         <w:rPr>
           <w:rFonts w:ascii="Trebuchet MS" w:hAnsi="Trebuchet MS"/>
         </w:rPr>
-        <w:t xml:space="preserve">. </w:t>
-      </w:r>
-      <w:proofErr w:type="spellStart"/>
-      <w:r>
+        <w:t>. Drillthrough</w:t>
+      </w:r>
+    </w:p>
+    <w:p>
+      <w:pPr>
+        <w:pStyle w:val="CommentSubject"/>
+      </w:pPr>
+      <w:r>
+        <w:t>Custom Tooltip (Category Tooltip):</w:t>
+      </w:r>
+    </w:p>
+    <w:p>
+      <w:pPr>
+        <w:pStyle w:val="BodyText"/>
+      </w:pPr>
+      <w:r>
+        <w:t xml:space="preserve">A hidden page called "Category Tooltip" was created with canvas size set to Tooltip (Format pane </w:t>
+      </w:r>
+      <w:r>
+        <w:rPr>
+          <w:rFonts w:ascii="Arial" w:hAnsi="Arial" w:cs="Arial"/>
+        </w:rPr>
+        <w:t>&gt;</w:t>
+      </w:r>
+      <w:r>
+        <w:t xml:space="preserve"> Page Information </w:t>
+      </w:r>
+      <w:r>
+        <w:rPr>
+          <w:rFonts w:ascii="Arial" w:hAnsi="Arial" w:cs="Arial"/>
+        </w:rPr>
+        <w:t>&gt;</w:t>
+      </w:r>
+      <w:r>
+        <w:t xml:space="preserve"> Canvas size dropdown) and "Allow use as tooltip" enabled. The page displays a small bar chart of Total Sales Amount by Subcategory and a Profit Margin % card. This page is applied as a custom tooltip to the category matrix on the Products &amp; Categories page (Format pane </w:t>
+      </w:r>
+      <w:r>
+        <w:rPr>
+          <w:rFonts w:ascii="Arial" w:hAnsi="Arial" w:cs="Arial"/>
+        </w:rPr>
+        <w:t>&gt;</w:t>
+      </w:r>
+      <w:r>
+        <w:t xml:space="preserve"> Tooltip</w:t>
+      </w:r>
+      <w:r>
+        <w:t>s</w:t>
+      </w:r>
+      <w:r>
+        <w:t xml:space="preserve"> </w:t>
+      </w:r>
+      <w:r>
+        <w:rPr>
+          <w:rFonts w:ascii="Arial" w:hAnsi="Arial" w:cs="Arial"/>
+        </w:rPr>
+        <w:t>&gt;</w:t>
+      </w:r>
+      <w:r>
+        <w:t xml:space="preserve"> Report page </w:t>
+      </w:r>
+      <w:r>
+        <w:rPr>
+          <w:rFonts w:ascii="Arial" w:hAnsi="Arial" w:cs="Arial"/>
+        </w:rPr>
+        <w:t>&gt;</w:t>
+      </w:r>
+      <w:r>
+        <w:t xml:space="preserve"> Category Tooltip). When users hover over any category </w:t>
+      </w:r>
+      <w:r>
+        <w:t xml:space="preserve">column </w:t>
+      </w:r>
+      <w:r>
+        <w:t>in the matrix, this mini report appears instead of the default single-value tooltip, providing instant context on subcategory performance within that category.</w:t>
+      </w:r>
+    </w:p>
+    <w:p>
+      <w:pPr>
+        <w:pStyle w:val="Heading1"/>
+      </w:pPr>
+      <w:r>
+        <w:t>publishing</w:t>
+      </w:r>
+    </w:p>
+    <w:p>
+      <w:pPr>
+        <w:pStyle w:val="BodyText"/>
+      </w:pPr>
+      <w:r>
+        <w:t>The finished Power BI Desktop file (PowerBI</w:t>
+      </w:r>
+      <w:r>
+        <w:t>_</w:t>
+      </w:r>
+      <w:r>
+        <w:t>Final</w:t>
+      </w:r>
+      <w:r>
+        <w:t>_</w:t>
+      </w:r>
+      <w:r>
+        <w:t xml:space="preserve">Project_Tutisani.pbix) was published to the Power BI Service via Home </w:t>
+      </w:r>
+      <w:r>
+        <w:rPr>
+          <w:rFonts w:ascii="Arial" w:hAnsi="Arial" w:cs="Arial"/>
+        </w:rPr>
+        <w:t>&gt;</w:t>
+      </w:r>
+      <w:r>
+        <w:t xml:space="preserve"> Publish. Once published, the report became accessible via a permanent URL in Power BI Service</w:t>
+      </w:r>
+      <w:r>
+        <w:t>,</w:t>
+      </w:r>
+      <w:r>
+        <w:t xml:space="preserve"> this same URL is shared with stakeholders and can be opened in a browser without requiring Power BI Desktop.</w:t>
+      </w:r>
+    </w:p>
+    <w:p>
+      <w:pPr>
+        <w:pStyle w:val="BodyText"/>
+        <w:keepNext/>
+        <w:jc w:val="center"/>
+      </w:pPr>
+      <w:r>
+        <w:drawing>
+          <wp:inline distT="0" distB="0" distL="0" distR="0" wp14:anchorId="1443A083" wp14:editId="7E53B371">
+            <wp:extent cx="5030467" cy="2390775"/>
+            <wp:effectExtent l="0" t="0" r="0" b="0"/>
+            <wp:docPr id="853480178" name="Picture 1"/>
+            <wp:cNvGraphicFramePr>
+              <a:graphicFrameLocks xmlns:a="http://schemas.openxmlformats.org/drawingml/2006/main" noChangeAspect="1"/>
+            </wp:cNvGraphicFramePr>
+            <a:graphic xmlns:a="http://schemas.openxmlformats.org/drawingml/2006/main">
+              <a:graphicData uri="http://schemas.openxmlformats.org/drawingml/2006/picture">
+                <pic:pic xmlns:pic="http://schemas.openxmlformats.org/drawingml/2006/picture">
+                  <pic:nvPicPr>
+                    <pic:cNvPr id="853480178" name=""/>
+                    <pic:cNvPicPr/>
+                  </pic:nvPicPr>
+                  <pic:blipFill>
+                    <a:blip r:embed="rId23"/>
+                    <a:stretch>
+                      <a:fillRect/>
+                    </a:stretch>
+                  </pic:blipFill>
+                  <pic:spPr>
+                    <a:xfrm>
+                      <a:off x="0" y="0"/>
+                      <a:ext cx="5049622" cy="2399879"/>
+                    </a:xfrm>
+                    <a:prstGeom prst="rect">
+                      <a:avLst/>
+                    </a:prstGeom>
+                  </pic:spPr>
+                </pic:pic>
+              </a:graphicData>
+            </a:graphic>
+          </wp:inline>
+        </w:drawing>
+      </w:r>
+    </w:p>
+    <w:p>
+      <w:pPr>
+        <w:pStyle w:val="Caption"/>
         <w:rPr>
           <w:rFonts w:ascii="Trebuchet MS" w:hAnsi="Trebuchet MS"/>
         </w:rPr>
-        <w:t>Drillthrough</w:t>
-      </w:r>
-      <w:proofErr w:type="spellEnd"/>
-    </w:p>
-    <w:p>
-      <w:pPr>
-        <w:pStyle w:val="CommentSubject"/>
-      </w:pPr>
-      <w:r>
-        <w:t>Custom Tooltip (Category Tooltip):</w:t>
+      </w:pPr>
+      <w:r>
+        <w:rPr>
+          <w:rFonts w:ascii="Trebuchet MS" w:hAnsi="Trebuchet MS"/>
+        </w:rPr>
+        <w:t xml:space="preserve">Figure </w:t>
+      </w:r>
+      <w:r>
+        <w:rPr>
+          <w:rFonts w:ascii="Trebuchet MS" w:hAnsi="Trebuchet MS"/>
+        </w:rPr>
+        <w:fldChar w:fldCharType="begin"/>
+      </w:r>
+      <w:r>
+        <w:rPr>
+          <w:rFonts w:ascii="Trebuchet MS" w:hAnsi="Trebuchet MS"/>
+        </w:rPr>
+        <w:instrText xml:space="preserve"> SEQ Figure \* ARABIC </w:instrText>
+      </w:r>
+      <w:r>
+        <w:rPr>
+          <w:rFonts w:ascii="Trebuchet MS" w:hAnsi="Trebuchet MS"/>
+        </w:rPr>
+        <w:fldChar w:fldCharType="separate"/>
+      </w:r>
+      <w:r>
+        <w:rPr>
+          <w:rFonts w:ascii="Trebuchet MS" w:hAnsi="Trebuchet MS"/>
+        </w:rPr>
+        <w:t>9</w:t>
+      </w:r>
+      <w:r>
+        <w:rPr>
+          <w:rFonts w:ascii="Trebuchet MS" w:hAnsi="Trebuchet MS"/>
+        </w:rPr>
+        <w:fldChar w:fldCharType="end"/>
+      </w:r>
+      <w:r>
+        <w:rPr>
+          <w:rFonts w:ascii="Trebuchet MS" w:hAnsi="Trebuchet MS"/>
+        </w:rPr>
+        <w:t>. Published report</w:t>
+      </w:r>
+    </w:p>
+    <w:p>
+      <w:pPr>
+        <w:pStyle w:val="Heading1"/>
+      </w:pPr>
+      <w:r>
+        <w:lastRenderedPageBreak/>
+        <w:t>Conclusion</w:t>
       </w:r>
     </w:p>
     <w:p>
@@ -8520,72 +8163,7 @@
         <w:pStyle w:val="BodyText"/>
       </w:pPr>
       <w:r>
-        <w:t xml:space="preserve">A hidden page called "Category Tooltip" was created with canvas size set to Tooltip (Format pane </w:t>
-      </w:r>
-      <w:r>
-        <w:rPr>
-          <w:rFonts w:ascii="Arial" w:hAnsi="Arial" w:cs="Arial"/>
-        </w:rPr>
-        <w:t>&gt;</w:t>
-      </w:r>
-      <w:r>
-        <w:t xml:space="preserve"> Page Information </w:t>
-      </w:r>
-      <w:r>
-        <w:rPr>
-          <w:rFonts w:ascii="Arial" w:hAnsi="Arial" w:cs="Arial"/>
-        </w:rPr>
-        <w:t>&gt;</w:t>
-      </w:r>
-      <w:r>
-        <w:t xml:space="preserve"> Canvas size dropdown) and "Allow use as tooltip" enabled. The page displays a small bar chart of Total Sales Amount by Subcategory and a Profit Margin % card. This page is applied as a custom tooltip to the category matrix on the Products &amp; Categories page (Format pane </w:t>
-      </w:r>
-      <w:r>
-        <w:rPr>
-          <w:rFonts w:ascii="Arial" w:hAnsi="Arial" w:cs="Arial"/>
-        </w:rPr>
-        <w:t>&gt;</w:t>
-      </w:r>
-      <w:r>
-        <w:t xml:space="preserve"> Tooltip</w:t>
-      </w:r>
-      <w:r>
-        <w:t>s</w:t>
-      </w:r>
-      <w:r>
-        <w:t xml:space="preserve"> </w:t>
-      </w:r>
-      <w:r>
-        <w:rPr>
-          <w:rFonts w:ascii="Arial" w:hAnsi="Arial" w:cs="Arial"/>
-        </w:rPr>
-        <w:t>&gt;</w:t>
-      </w:r>
-      <w:r>
-        <w:t xml:space="preserve"> Report page </w:t>
-      </w:r>
-      <w:r>
-        <w:rPr>
-          <w:rFonts w:ascii="Arial" w:hAnsi="Arial" w:cs="Arial"/>
-        </w:rPr>
-        <w:t>&gt;</w:t>
-      </w:r>
-      <w:r>
-        <w:t xml:space="preserve"> Category Tooltip). When users hover over any category </w:t>
-      </w:r>
-      <w:r>
-        <w:t xml:space="preserve">column </w:t>
-      </w:r>
-      <w:r>
-        <w:t>in the matrix, this mini report appears instead of the default single-value tooltip, providing instant context on subcategory performance within that category.</w:t>
-      </w:r>
-    </w:p>
-    <w:p>
-      <w:pPr>
-        <w:pStyle w:val="Heading1"/>
-      </w:pPr>
-      <w:r>
-        <w:t>Conclusion</w:t>
+        <w:t>This Meridian Supply Co. sales analytics report delivers a complete, interactive solution for sales and operations leadership to analyze revenue, profit, and fulfillment performance in seconds. The three visible pages, Overview, Products &amp; Categories, and Customers &amp; Markets, each provide distinct analytical insights through optimized visuals, synced slicers, and interactive features including page navigation, bookmarks, drillthrough, and custom tooltips. A Python Pareto chart reveals the 80/20 principle in product concentration, while conditional formatting and dynamic titles guide users to actionable insights without requiring technical knowledge.</w:t>
       </w:r>
     </w:p>
     <w:p>
@@ -8593,45 +8171,20 @@
         <w:pStyle w:val="BodyText"/>
       </w:pPr>
       <w:r>
-        <w:t>This Meridian Supply Co. sales analytics report delivers a complete, interactive solution for sales and operations leadership to analyze revenue, profit, and fulfillment performance in seconds. The three visible pages</w:t>
-      </w:r>
-      <w:r>
-        <w:t xml:space="preserve">, </w:t>
-      </w:r>
-      <w:r>
-        <w:t>Overview, Products &amp; Categories, and Customers &amp; Markets</w:t>
-      </w:r>
-      <w:r>
-        <w:t xml:space="preserve">, </w:t>
-      </w:r>
-      <w:r>
-        <w:t xml:space="preserve">each provide distinct analytical insights through optimized visuals, synced slicers, and interactive features including page navigation, bookmarks, </w:t>
-      </w:r>
-      <w:proofErr w:type="spellStart"/>
-      <w:r>
-        <w:t>drillthrough</w:t>
-      </w:r>
-      <w:proofErr w:type="spellEnd"/>
-      <w:r>
-        <w:t>, and custom tooltips. A Python Pareto chart reveals the 80/20 principle in product concentration, while conditional formatting and dynamic titles guide users to actionable insights without requiring technical knowledge.</w:t>
+        <w:t xml:space="preserve">The report is published in Power BI Service and accessible </w:t>
+      </w:r>
+      <w:r>
+        <w:t>through</w:t>
+      </w:r>
+      <w:r>
+        <w:t xml:space="preserve"> this link:</w:t>
       </w:r>
     </w:p>
     <w:p>
       <w:pPr>
         <w:pStyle w:val="BodyText"/>
       </w:pPr>
-      <w:r>
-        <w:t xml:space="preserve">The report is published in Power BI Service and accessible </w:t>
-      </w:r>
-      <w:r>
-        <w:t>with this link:</w:t>
-      </w:r>
-    </w:p>
-    <w:p>
-      <w:pPr>
-        <w:pStyle w:val="BodyText"/>
-      </w:pPr>
-      <w:hyperlink r:id="rId23" w:history="1">
+      <w:hyperlink r:id="rId24" w:history="1">
         <w:r>
           <w:rPr>
             <w:rStyle w:val="Hyperlink"/>
@@ -8649,9 +8202,9 @@
       </w:r>
     </w:p>
     <w:sectPr>
-      <w:headerReference w:type="default" r:id="rId24"/>
-      <w:footerReference w:type="default" r:id="rId25"/>
-      <w:footerReference w:type="first" r:id="rId26"/>
+      <w:headerReference w:type="default" r:id="rId25"/>
+      <w:footerReference w:type="default" r:id="rId26"/>
+      <w:footerReference w:type="first" r:id="rId27"/>
       <w:pgSz w:w="11909" w:h="16834" w:code="9"/>
       <w:pgMar w:top="1134" w:right="851" w:bottom="1134" w:left="1134" w:header="720" w:footer="720" w:gutter="567"/>
       <w:cols w:space="720"/>
@@ -12503,7 +12056,6 @@
   </w:num>
   <w:num w:numId="31" w16cid:durableId="855922023">
     <w:abstractNumId w:val="8"/>
-    <w:lvlOverride w:ilvl="0"/>
   </w:num>
   <w:num w:numId="32" w16cid:durableId="1320422852">
     <w:abstractNumId w:val="12"/>
@@ -13036,6 +12588,7 @@
   <w:style w:type="character" w:default="1" w:styleId="DefaultParagraphFont">
     <w:name w:val="Default Paragraph Font"/>
     <w:uiPriority w:val="1"/>
+    <w:semiHidden/>
     <w:unhideWhenUsed/>
   </w:style>
   <w:style w:type="table" w:default="1" w:styleId="TableNormal">
@@ -13743,6 +13296,18 @@
       <w:shd w:val="clear" w:color="auto" w:fill="E1DFDD"/>
     </w:rPr>
   </w:style>
+  <w:style w:type="character" w:styleId="FollowedHyperlink">
+    <w:name w:val="FollowedHyperlink"/>
+    <w:basedOn w:val="DefaultParagraphFont"/>
+    <w:uiPriority w:val="99"/>
+    <w:semiHidden/>
+    <w:unhideWhenUsed/>
+    <w:rsid w:val="00403B3E"/>
+    <w:rPr>
+      <w:color w:val="954F72" w:themeColor="followedHyperlink"/>
+      <w:u w:val="single"/>
+    </w:rPr>
+  </w:style>
 </w:styles>
 </file>
 
@@ -14051,6 +13616,24 @@
 </file>
 
 <file path=customXml/item2.xml><?xml version="1.0" encoding="utf-8"?>
+<b:Sources xmlns:b="http://schemas.openxmlformats.org/officeDocument/2006/bibliography" xmlns="http://schemas.openxmlformats.org/officeDocument/2006/bibliography" SelectedStyle="\HarvardAnglia2008OfficeOnline.xsl" StyleName="Harvard - Anglia" Version="2008"/>
+</file>
+
+<file path=customXml/item3.xml><?xml version="1.0" encoding="utf-8"?>
+<p:properties xmlns:p="http://schemas.microsoft.com/office/2006/metadata/properties" xmlns:xsi="http://www.w3.org/2001/XMLSchema-instance" xmlns:pc="http://schemas.microsoft.com/office/infopath/2007/PartnerControls">
+  <documentManagement>
+    <SharedWithUsers xmlns="7f0dcb33-685e-48d8-b644-2ef2786c1229">
+      <UserInfo>
+        <DisplayName/>
+        <AccountId xsi:nil="true"/>
+        <AccountType/>
+      </UserInfo>
+    </SharedWithUsers>
+  </documentManagement>
+</p:properties>
+</file>
+
+<file path=customXml/item4.xml><?xml version="1.0" encoding="utf-8"?>
 <ct:contentTypeSchema xmlns:ct="http://schemas.microsoft.com/office/2006/metadata/contentType" xmlns:ma="http://schemas.microsoft.com/office/2006/metadata/properties/metaAttributes" ct:_="" ma:_="" ma:contentTypeName="Document" ma:contentTypeID="0x010100B3483E581E535547A5C5133F57803043" ma:contentTypeVersion="7" ma:contentTypeDescription="Create a new document." ma:contentTypeScope="" ma:versionID="26f0e3c34181377a2b428b97b0aacf58">
   <xsd:schema xmlns:xsd="http://www.w3.org/2001/XMLSchema" xmlns:xs="http://www.w3.org/2001/XMLSchema" xmlns:p="http://schemas.microsoft.com/office/2006/metadata/properties" xmlns:ns2="0a074a96-e172-4849-a42b-0522bc04182b" xmlns:ns3="7f0dcb33-685e-48d8-b644-2ef2786c1229" targetNamespace="http://schemas.microsoft.com/office/2006/metadata/properties" ma:root="true" ma:fieldsID="c6eeec6c9df2cadb2fce64bd00511549" ns2:_="" ns3:_="">
     <xsd:import namespace="0a074a96-e172-4849-a42b-0522bc04182b"/>
@@ -14235,24 +13818,6 @@
 </ct:contentTypeSchema>
 </file>
 
-<file path=customXml/item3.xml><?xml version="1.0" encoding="utf-8"?>
-<p:properties xmlns:p="http://schemas.microsoft.com/office/2006/metadata/properties" xmlns:xsi="http://www.w3.org/2001/XMLSchema-instance" xmlns:pc="http://schemas.microsoft.com/office/infopath/2007/PartnerControls">
-  <documentManagement>
-    <SharedWithUsers xmlns="7f0dcb33-685e-48d8-b644-2ef2786c1229">
-      <UserInfo>
-        <DisplayName/>
-        <AccountId xsi:nil="true"/>
-        <AccountType/>
-      </UserInfo>
-    </SharedWithUsers>
-  </documentManagement>
-</p:properties>
-</file>
-
-<file path=customXml/item4.xml><?xml version="1.0" encoding="utf-8"?>
-<b:Sources xmlns:b="http://schemas.openxmlformats.org/officeDocument/2006/bibliography" xmlns="http://schemas.openxmlformats.org/officeDocument/2006/bibliography" SelectedStyle="\HarvardAnglia2008OfficeOnline.xsl" StyleName="Harvard - Anglia" Version="2008"/>
-</file>
-
 <file path=customXml/itemProps1.xml><?xml version="1.0" encoding="utf-8"?>
 <ds:datastoreItem xmlns:ds="http://schemas.openxmlformats.org/officeDocument/2006/customXml" ds:itemID="{CEAD825D-2413-46BA-BB1F-DCE637B19B0C}">
   <ds:schemaRefs>
@@ -14262,6 +13827,24 @@
 </file>
 
 <file path=customXml/itemProps2.xml><?xml version="1.0" encoding="utf-8"?>
+<ds:datastoreItem xmlns:ds="http://schemas.openxmlformats.org/officeDocument/2006/customXml" ds:itemID="{FDBCFBA0-8D1D-4B98-8BFA-B2B6E4DF45A4}">
+  <ds:schemaRefs>
+    <ds:schemaRef ds:uri="http://schemas.openxmlformats.org/officeDocument/2006/bibliography"/>
+  </ds:schemaRefs>
+</ds:datastoreItem>
+</file>
+
+<file path=customXml/itemProps3.xml><?xml version="1.0" encoding="utf-8"?>
+<ds:datastoreItem xmlns:ds="http://schemas.openxmlformats.org/officeDocument/2006/customXml" ds:itemID="{E4B4D352-B35B-4B3A-95D2-902933709BD2}">
+  <ds:schemaRefs>
+    <ds:schemaRef ds:uri="http://schemas.microsoft.com/office/2006/metadata/properties"/>
+    <ds:schemaRef ds:uri="http://schemas.microsoft.com/office/infopath/2007/PartnerControls"/>
+    <ds:schemaRef ds:uri="7f0dcb33-685e-48d8-b644-2ef2786c1229"/>
+  </ds:schemaRefs>
+</ds:datastoreItem>
+</file>
+
+<file path=customXml/itemProps4.xml><?xml version="1.0" encoding="utf-8"?>
 <ds:datastoreItem xmlns:ds="http://schemas.openxmlformats.org/officeDocument/2006/customXml" ds:itemID="{2240CE2F-0274-489A-BA80-8887BFB6B269}">
   <ds:schemaRefs>
     <ds:schemaRef ds:uri="http://schemas.microsoft.com/office/2006/metadata/contentType"/>
@@ -14278,22 +13861,4 @@
     <ds:schemaRef ds:uri="http://schemas.microsoft.com/internal/obd"/>
   </ds:schemaRefs>
 </ds:datastoreItem>
-</file>
-
-<file path=customXml/itemProps3.xml><?xml version="1.0" encoding="utf-8"?>
-<ds:datastoreItem xmlns:ds="http://schemas.openxmlformats.org/officeDocument/2006/customXml" ds:itemID="{E4B4D352-B35B-4B3A-95D2-902933709BD2}">
-  <ds:schemaRefs>
-    <ds:schemaRef ds:uri="http://schemas.microsoft.com/office/2006/metadata/properties"/>
-    <ds:schemaRef ds:uri="http://schemas.microsoft.com/office/infopath/2007/PartnerControls"/>
-    <ds:schemaRef ds:uri="7f0dcb33-685e-48d8-b644-2ef2786c1229"/>
-  </ds:schemaRefs>
-</ds:datastoreItem>
-</file>
-
-<file path=customXml/itemProps4.xml><?xml version="1.0" encoding="utf-8"?>
-<ds:datastoreItem xmlns:ds="http://schemas.openxmlformats.org/officeDocument/2006/customXml" ds:itemID="{FDBCFBA0-8D1D-4B98-8BFA-B2B6E4DF45A4}">
-  <ds:schemaRefs>
-    <ds:schemaRef ds:uri="http://schemas.openxmlformats.org/officeDocument/2006/bibliography"/>
-  </ds:schemaRefs>
-</ds:datastoreItem>
 </file>
</xml_diff>